<commit_message>
Add SVG diagrams for various workflows including account management, admin dashboard, inventory management, order classification, and password reset
</commit_message>
<xml_diff>
--- a/docs/bao-cao-phan-tich-thiet-ke-he-thong.docx
+++ b/docs/bao-cao-phan-tich-thiet-ke-he-thong.docx
@@ -161,7 +161,7 @@
           </w:tcPr>
           <w:p>
             <w:r>
-              <w:t xml:space="preserve">Ứng dụng cài đặt riêng trên điện thoại không nằm trong báo cáo này</w:t>
+              <w:t xml:space="preserve">Cổng thanh toán thật, tích hợp vận chuyển thật, kế toán/thuế</w:t>
             </w:r>
           </w:p>
         </w:tc>
@@ -415,11 +415,6 @@
     <w:p>
       <w:r>
         <w:t xml:space="preserve">• Hệ thống kế toán, hóa đơn điện tử và báo cáo thuế.</w:t>
-      </w:r>
-    </w:p>
-    <w:p>
-      <w:r>
-        <w:t xml:space="preserve">• Ứng dụng cài đặt riêng trên điện thoại.</w:t>
       </w:r>
     </w:p>
     <w:p>
@@ -708,7 +703,7 @@
           </w:tcPr>
           <w:p>
             <w:r>
-              <w:t xml:space="preserve">Đăng ký tài khoản bằng tên, email, mật khẩu</w:t>
+              <w:t xml:space="preserve">Đăng ký tài khoản bằng tên, email, mật khẩu; mật khẩu được mã hóa phía client trước khi gửi</w:t>
             </w:r>
           </w:p>
         </w:tc>
@@ -740,7 +735,7 @@
           </w:tcPr>
           <w:p>
             <w:r>
-              <w:t xml:space="preserve">Đăng nhập, lưu token và tải hồ sơ người dùng</w:t>
+              <w:t xml:space="preserve">Đăng nhập, lưu token và tải hồ sơ người dùng; mật khẩu gửi dạng passwordEncrypted</w:t>
             </w:r>
           </w:p>
         </w:tc>
@@ -804,7 +799,7 @@
           </w:tcPr>
           <w:p>
             <w:r>
-              <w:t xml:space="preserve">Cập nhật hồ sơ, avatar, số điện thoại, địa chỉ mặc định</w:t>
+              <w:t xml:space="preserve">Cập nhật hồ sơ, avatar, số liên hệ, địa chỉ mặc định</w:t>
             </w:r>
           </w:p>
         </w:tc>
@@ -1092,7 +1087,7 @@
           </w:tcPr>
           <w:p>
             <w:r>
-              <w:t xml:space="preserve">Khách hàng xem lịch sử và chi tiết đơn hàng</w:t>
+              <w:t xml:space="preserve">Khách hàng xem lịch sử và chi tiết đơn hàng; hệ thống phân biệt đơn của khách đã đăng ký và khách chưa đăng ký</w:t>
             </w:r>
           </w:p>
         </w:tc>
@@ -1284,7 +1279,7 @@
           </w:tcPr>
           <w:p>
             <w:r>
-              <w:t xml:space="preserve">Quản lý đơn hàng và cập nhật trạng thái</w:t>
+              <w:t xml:space="preserve">Quản lý đơn hàng, lọc theo trạng thái, thanh toán, ngày và loại khách</w:t>
             </w:r>
           </w:p>
         </w:tc>
@@ -1634,6 +1629,38 @@
           </w:tcPr>
           <w:p>
             <w:r>
+              <w:t xml:space="preserve">Mật khẩu không gửi dạng rõ trong payload auth</w:t>
+            </w:r>
+          </w:p>
+        </w:tc>
+        <w:tc>
+          <w:tcPr>
+            <w:tcW w:w="2400" w:type="dxa"/>
+          </w:tcPr>
+          <w:p>
+            <w:r>
+              <w:t xml:space="preserve">Client lấy public key và mã hóa RSA-OAEP thành passwordEncrypted</w:t>
+            </w:r>
+          </w:p>
+        </w:tc>
+      </w:tr>
+      <w:tr>
+        <w:tc>
+          <w:tcPr>
+            <w:tcW w:w="2400" w:type="dxa"/>
+          </w:tcPr>
+          <w:p>
+            <w:r>
+              <w:t xml:space="preserve">Bảo mật</w:t>
+            </w:r>
+          </w:p>
+        </w:tc>
+        <w:tc>
+          <w:tcPr>
+            <w:tcW w:w="2400" w:type="dxa"/>
+          </w:tcPr>
+          <w:p>
+            <w:r>
               <w:t xml:space="preserve">API admin chỉ cho role admin</w:t>
             </w:r>
           </w:p>
@@ -2060,6 +2087,11 @@
     </w:p>
     <w:p>
       <w:r>
+        <w:t xml:space="preserve">• Đơn có trường user được phân loại là khách đã đăng ký; đơn không có user được phân loại là khách chưa đăng ký.</w:t>
+      </w:r>
+    </w:p>
+    <w:p>
+      <w:r>
         <w:t xml:space="preserve">• Doanh thu chỉ tính từ đơn đã thanh toán hoặc hoàn thành.</w:t>
       </w:r>
     </w:p>
@@ -2070,11 +2102,6 @@
     </w:p>
     <w:p>
       <w:r>
-        <w:t xml:space="preserve">• Báo cáo này không phân tích ứng dụng cài đặt riêng trên điện thoại.</w:t>
-      </w:r>
-    </w:p>
-    <w:p>
-      <w:r>
         <w:t xml:space="preserve"/>
       </w:r>
     </w:p>
@@ -2189,7 +2216,7 @@
     </w:p>
     <w:p>
       <w:r>
-        <w:t xml:space="preserve">5. Hệ thống tạo đơn hàng, lưu thông tin khách, sản phẩm, tổng tiền và trạng thái.</w:t>
+        <w:t xml:space="preserve">5. Hệ thống tạo đơn hàng, lưu thông tin khách, sản phẩm, tổng tiền, trạng thái và phân loại khách đã đăng ký/chưa đăng ký.</w:t>
       </w:r>
     </w:p>
     <w:p>
@@ -3166,7 +3193,7 @@
           </w:tcPr>
           <w:p>
             <w:r>
-              <w:t xml:space="preserve">Người dùng nhập tên/email/mật khẩu; server kiểm tra; tạo User role customer; trả token</w:t>
+              <w:t xml:space="preserve">Người dùng nhập tên/email/mật khẩu; client mã hóa password; server giải mã, kiểm tra; tạo User role customer; trả token</w:t>
             </w:r>
           </w:p>
         </w:tc>
@@ -3218,7 +3245,7 @@
           </w:tcPr>
           <w:p>
             <w:r>
-              <w:t xml:space="preserve">Nhập email/mật khẩu; server kiểm tra hash; trả JWT; client lưu user/token</w:t>
+              <w:t xml:space="preserve">Nhập email/mật khẩu; client mã hóa password; server giải mã và kiểm tra hash; trả JWT; client lưu user/token</w:t>
             </w:r>
           </w:p>
         </w:tc>
@@ -3582,7 +3609,7 @@
           </w:tcPr>
           <w:p>
             <w:r>
-              <w:t xml:space="preserve">Chọn địa chỉ, phương thức thanh toán; tạo order; clear cart nếu cần</w:t>
+              <w:t xml:space="preserve">Chọn địa chỉ, phương thức thanh toán; tạo order; gắn user nếu đã đăng nhập; clear cart nếu cần</w:t>
             </w:r>
           </w:p>
         </w:tc>
@@ -3602,7 +3629,7 @@
           </w:tcPr>
           <w:p>
             <w:r>
-              <w:t xml:space="preserve">Order được tạo, khách nhận mã đơn</w:t>
+              <w:t xml:space="preserve">Order được tạo, khách nhận mã đơn và customerType</w:t>
             </w:r>
           </w:p>
         </w:tc>
@@ -3842,7 +3869,7 @@
           </w:tcPr>
           <w:p>
             <w:r>
-              <w:t xml:space="preserve">Lọc đơn; mở chi tiết; đổi trạng thái; gửi notification</w:t>
+              <w:t xml:space="preserve">Lọc đơn theo status/payment/date/customerType; mở chi tiết; đổi trạng thái; gửi notification</w:t>
             </w:r>
           </w:p>
         </w:tc>
@@ -5586,6 +5613,48 @@
           </w:tcPr>
           <w:p>
             <w:r>
+              <w:t xml:space="preserve">GET</w:t>
+            </w:r>
+          </w:p>
+        </w:tc>
+        <w:tc>
+          <w:tcPr>
+            <w:tcW w:w="2400" w:type="dxa"/>
+          </w:tcPr>
+          <w:p>
+            <w:r>
+              <w:t xml:space="preserve">/password-public-key</w:t>
+            </w:r>
+          </w:p>
+        </w:tc>
+        <w:tc>
+          <w:tcPr>
+            <w:tcW w:w="2400" w:type="dxa"/>
+          </w:tcPr>
+          <w:p>
+            <w:r>
+              <w:t xml:space="preserve">Public</w:t>
+            </w:r>
+          </w:p>
+        </w:tc>
+        <w:tc>
+          <w:tcPr>
+            <w:tcW w:w="2400" w:type="dxa"/>
+          </w:tcPr>
+          <w:p>
+            <w:r>
+              <w:t xml:space="preserve">Lấy public key RSA-OAEP để mã hóa mật khẩu</w:t>
+            </w:r>
+          </w:p>
+        </w:tc>
+      </w:tr>
+      <w:tr>
+        <w:tc>
+          <w:tcPr>
+            <w:tcW w:w="2400" w:type="dxa"/>
+          </w:tcPr>
+          <w:p>
+            <w:r>
               <w:t xml:space="preserve">POST</w:t>
             </w:r>
           </w:p>
@@ -5616,7 +5685,7 @@
           </w:tcPr>
           <w:p>
             <w:r>
-              <w:t xml:space="preserve">Đăng ký</w:t>
+              <w:t xml:space="preserve">Đăng ký với passwordEncrypted</w:t>
             </w:r>
           </w:p>
         </w:tc>
@@ -5658,7 +5727,7 @@
           </w:tcPr>
           <w:p>
             <w:r>
-              <w:t xml:space="preserve">Đăng nhập</w:t>
+              <w:t xml:space="preserve">Đăng nhập với passwordEncrypted</w:t>
             </w:r>
           </w:p>
         </w:tc>
@@ -5742,7 +5811,7 @@
           </w:tcPr>
           <w:p>
             <w:r>
-              <w:t xml:space="preserve">Đặt lại mật khẩu</w:t>
+              <w:t xml:space="preserve">Đặt lại mật khẩu với passwordEncrypted</w:t>
             </w:r>
           </w:p>
         </w:tc>
@@ -5890,7 +5959,7 @@
           </w:tcPr>
           <w:p>
             <w:r>
-              <w:t xml:space="preserve">/products</w:t>
+              <w:t xml:space="preserve">/products?page&amp;limit&amp;category&amp;query&amp;sort</w:t>
             </w:r>
           </w:p>
         </w:tc>
@@ -5910,7 +5979,7 @@
           </w:tcPr>
           <w:p>
             <w:r>
-              <w:t xml:space="preserve">Lấy danh sách sản phẩm</w:t>
+              <w:t xml:space="preserve">Lấy danh sách sản phẩm phân trang, mặc định 10 sản phẩm/trang</w:t>
             </w:r>
           </w:p>
         </w:tc>
@@ -5974,6 +6043,48 @@
           </w:tcPr>
           <w:p>
             <w:r>
+              <w:t xml:space="preserve">/reviews?productId=:id</w:t>
+            </w:r>
+          </w:p>
+        </w:tc>
+        <w:tc>
+          <w:tcPr>
+            <w:tcW w:w="2400" w:type="dxa"/>
+          </w:tcPr>
+          <w:p>
+            <w:r>
+              <w:t xml:space="preserve">Public</w:t>
+            </w:r>
+          </w:p>
+        </w:tc>
+        <w:tc>
+          <w:tcPr>
+            <w:tcW w:w="2400" w:type="dxa"/>
+          </w:tcPr>
+          <w:p>
+            <w:r>
+              <w:t xml:space="preserve">Lấy review theo sản phẩm</w:t>
+            </w:r>
+          </w:p>
+        </w:tc>
+      </w:tr>
+      <w:tr>
+        <w:tc>
+          <w:tcPr>
+            <w:tcW w:w="2400" w:type="dxa"/>
+          </w:tcPr>
+          <w:p>
+            <w:r>
+              <w:t xml:space="preserve">POST</w:t>
+            </w:r>
+          </w:p>
+        </w:tc>
+        <w:tc>
+          <w:tcPr>
+            <w:tcW w:w="2400" w:type="dxa"/>
+          </w:tcPr>
+          <w:p>
+            <w:r>
               <w:t xml:space="preserve">/reviews</w:t>
             </w:r>
           </w:p>
@@ -5984,17 +6095,59 @@
           </w:tcPr>
           <w:p>
             <w:r>
-              <w:t xml:space="preserve">Public</w:t>
-            </w:r>
-          </w:p>
-        </w:tc>
-        <w:tc>
-          <w:tcPr>
-            <w:tcW w:w="2400" w:type="dxa"/>
-          </w:tcPr>
-          <w:p>
-            <w:r>
-              <w:t xml:space="preserve">Lấy review theo sản phẩm</w:t>
+              <w:t xml:space="preserve">User</w:t>
+            </w:r>
+          </w:p>
+        </w:tc>
+        <w:tc>
+          <w:tcPr>
+            <w:tcW w:w="2400" w:type="dxa"/>
+          </w:tcPr>
+          <w:p>
+            <w:r>
+              <w:t xml:space="preserve">Tạo review</w:t>
+            </w:r>
+          </w:p>
+        </w:tc>
+      </w:tr>
+      <w:tr>
+        <w:tc>
+          <w:tcPr>
+            <w:tcW w:w="2400" w:type="dxa"/>
+          </w:tcPr>
+          <w:p>
+            <w:r>
+              <w:t xml:space="preserve">GET</w:t>
+            </w:r>
+          </w:p>
+        </w:tc>
+        <w:tc>
+          <w:tcPr>
+            <w:tcW w:w="2400" w:type="dxa"/>
+          </w:tcPr>
+          <w:p>
+            <w:r>
+              <w:t xml:space="preserve">/cart</w:t>
+            </w:r>
+          </w:p>
+        </w:tc>
+        <w:tc>
+          <w:tcPr>
+            <w:tcW w:w="2400" w:type="dxa"/>
+          </w:tcPr>
+          <w:p>
+            <w:r>
+              <w:t xml:space="preserve">User</w:t>
+            </w:r>
+          </w:p>
+        </w:tc>
+        <w:tc>
+          <w:tcPr>
+            <w:tcW w:w="2400" w:type="dxa"/>
+          </w:tcPr>
+          <w:p>
+            <w:r>
+              <w:t xml:space="preserve">Lấy giỏ hàng</w:t>
             </w:r>
           </w:p>
         </w:tc>
@@ -6016,7 +6169,7 @@
           </w:tcPr>
           <w:p>
             <w:r>
-              <w:t xml:space="preserve">/reviews</w:t>
+              <w:t xml:space="preserve">/cart/items</w:t>
             </w:r>
           </w:p>
         </w:tc>
@@ -6036,7 +6189,175 @@
           </w:tcPr>
           <w:p>
             <w:r>
-              <w:t xml:space="preserve">Tạo review</w:t>
+              <w:t xml:space="preserve">Thêm sản phẩm vào giỏ</w:t>
+            </w:r>
+          </w:p>
+        </w:tc>
+      </w:tr>
+      <w:tr>
+        <w:tc>
+          <w:tcPr>
+            <w:tcW w:w="2400" w:type="dxa"/>
+          </w:tcPr>
+          <w:p>
+            <w:r>
+              <w:t xml:space="preserve">PATCH</w:t>
+            </w:r>
+          </w:p>
+        </w:tc>
+        <w:tc>
+          <w:tcPr>
+            <w:tcW w:w="2400" w:type="dxa"/>
+          </w:tcPr>
+          <w:p>
+            <w:r>
+              <w:t xml:space="preserve">/cart/items/:productId</w:t>
+            </w:r>
+          </w:p>
+        </w:tc>
+        <w:tc>
+          <w:tcPr>
+            <w:tcW w:w="2400" w:type="dxa"/>
+          </w:tcPr>
+          <w:p>
+            <w:r>
+              <w:t xml:space="preserve">User</w:t>
+            </w:r>
+          </w:p>
+        </w:tc>
+        <w:tc>
+          <w:tcPr>
+            <w:tcW w:w="2400" w:type="dxa"/>
+          </w:tcPr>
+          <w:p>
+            <w:r>
+              <w:t xml:space="preserve">Cập nhật số lượng</w:t>
+            </w:r>
+          </w:p>
+        </w:tc>
+      </w:tr>
+      <w:tr>
+        <w:tc>
+          <w:tcPr>
+            <w:tcW w:w="2400" w:type="dxa"/>
+          </w:tcPr>
+          <w:p>
+            <w:r>
+              <w:t xml:space="preserve">DELETE</w:t>
+            </w:r>
+          </w:p>
+        </w:tc>
+        <w:tc>
+          <w:tcPr>
+            <w:tcW w:w="2400" w:type="dxa"/>
+          </w:tcPr>
+          <w:p>
+            <w:r>
+              <w:t xml:space="preserve">/cart/items/:productId</w:t>
+            </w:r>
+          </w:p>
+        </w:tc>
+        <w:tc>
+          <w:tcPr>
+            <w:tcW w:w="2400" w:type="dxa"/>
+          </w:tcPr>
+          <w:p>
+            <w:r>
+              <w:t xml:space="preserve">User</w:t>
+            </w:r>
+          </w:p>
+        </w:tc>
+        <w:tc>
+          <w:tcPr>
+            <w:tcW w:w="2400" w:type="dxa"/>
+          </w:tcPr>
+          <w:p>
+            <w:r>
+              <w:t xml:space="preserve">Xóa item</w:t>
+            </w:r>
+          </w:p>
+        </w:tc>
+      </w:tr>
+      <w:tr>
+        <w:tc>
+          <w:tcPr>
+            <w:tcW w:w="2400" w:type="dxa"/>
+          </w:tcPr>
+          <w:p>
+            <w:r>
+              <w:t xml:space="preserve">DELETE</w:t>
+            </w:r>
+          </w:p>
+        </w:tc>
+        <w:tc>
+          <w:tcPr>
+            <w:tcW w:w="2400" w:type="dxa"/>
+          </w:tcPr>
+          <w:p>
+            <w:r>
+              <w:t xml:space="preserve">/cart</w:t>
+            </w:r>
+          </w:p>
+        </w:tc>
+        <w:tc>
+          <w:tcPr>
+            <w:tcW w:w="2400" w:type="dxa"/>
+          </w:tcPr>
+          <w:p>
+            <w:r>
+              <w:t xml:space="preserve">User</w:t>
+            </w:r>
+          </w:p>
+        </w:tc>
+        <w:tc>
+          <w:tcPr>
+            <w:tcW w:w="2400" w:type="dxa"/>
+          </w:tcPr>
+          <w:p>
+            <w:r>
+              <w:t xml:space="preserve">Xóa giỏ</w:t>
+            </w:r>
+          </w:p>
+        </w:tc>
+      </w:tr>
+      <w:tr>
+        <w:tc>
+          <w:tcPr>
+            <w:tcW w:w="2400" w:type="dxa"/>
+          </w:tcPr>
+          <w:p>
+            <w:r>
+              <w:t xml:space="preserve">POST</w:t>
+            </w:r>
+          </w:p>
+        </w:tc>
+        <w:tc>
+          <w:tcPr>
+            <w:tcW w:w="2400" w:type="dxa"/>
+          </w:tcPr>
+          <w:p>
+            <w:r>
+              <w:t xml:space="preserve">/orders</w:t>
+            </w:r>
+          </w:p>
+        </w:tc>
+        <w:tc>
+          <w:tcPr>
+            <w:tcW w:w="2400" w:type="dxa"/>
+          </w:tcPr>
+          <w:p>
+            <w:r>
+              <w:t xml:space="preserve">Optional User</w:t>
+            </w:r>
+          </w:p>
+        </w:tc>
+        <w:tc>
+          <w:tcPr>
+            <w:tcW w:w="2400" w:type="dxa"/>
+          </w:tcPr>
+          <w:p>
+            <w:r>
+              <w:t xml:space="preserve">Tạo đơn hàng, trả customerType</w:t>
             </w:r>
           </w:p>
         </w:tc>
@@ -6058,7 +6379,7 @@
           </w:tcPr>
           <w:p>
             <w:r>
-              <w:t xml:space="preserve">/cart</w:t>
+              <w:t xml:space="preserve">/orders/me</w:t>
             </w:r>
           </w:p>
         </w:tc>
@@ -6078,7 +6399,49 @@
           </w:tcPr>
           <w:p>
             <w:r>
-              <w:t xml:space="preserve">Lấy giỏ hàng</w:t>
+              <w:t xml:space="preserve">Lịch sử đơn hàng</w:t>
+            </w:r>
+          </w:p>
+        </w:tc>
+      </w:tr>
+      <w:tr>
+        <w:tc>
+          <w:tcPr>
+            <w:tcW w:w="2400" w:type="dxa"/>
+          </w:tcPr>
+          <w:p>
+            <w:r>
+              <w:t xml:space="preserve">GET</w:t>
+            </w:r>
+          </w:p>
+        </w:tc>
+        <w:tc>
+          <w:tcPr>
+            <w:tcW w:w="2400" w:type="dxa"/>
+          </w:tcPr>
+          <w:p>
+            <w:r>
+              <w:t xml:space="preserve">/orders/:orderCode</w:t>
+            </w:r>
+          </w:p>
+        </w:tc>
+        <w:tc>
+          <w:tcPr>
+            <w:tcW w:w="2400" w:type="dxa"/>
+          </w:tcPr>
+          <w:p>
+            <w:r>
+              <w:t xml:space="preserve">Optional User</w:t>
+            </w:r>
+          </w:p>
+        </w:tc>
+        <w:tc>
+          <w:tcPr>
+            <w:tcW w:w="2400" w:type="dxa"/>
+          </w:tcPr>
+          <w:p>
+            <w:r>
+              <w:t xml:space="preserve">Tra cứu đơn</w:t>
             </w:r>
           </w:p>
         </w:tc>
@@ -6100,7 +6463,49 @@
           </w:tcPr>
           <w:p>
             <w:r>
-              <w:t xml:space="preserve">/cart/items</w:t>
+              <w:t xml:space="preserve">/contact</w:t>
+            </w:r>
+          </w:p>
+        </w:tc>
+        <w:tc>
+          <w:tcPr>
+            <w:tcW w:w="2400" w:type="dxa"/>
+          </w:tcPr>
+          <w:p>
+            <w:r>
+              <w:t xml:space="preserve">Optional User</w:t>
+            </w:r>
+          </w:p>
+        </w:tc>
+        <w:tc>
+          <w:tcPr>
+            <w:tcW w:w="2400" w:type="dxa"/>
+          </w:tcPr>
+          <w:p>
+            <w:r>
+              <w:t xml:space="preserve">Gửi liên hệ</w:t>
+            </w:r>
+          </w:p>
+        </w:tc>
+      </w:tr>
+      <w:tr>
+        <w:tc>
+          <w:tcPr>
+            <w:tcW w:w="2400" w:type="dxa"/>
+          </w:tcPr>
+          <w:p>
+            <w:r>
+              <w:t xml:space="preserve">GET</w:t>
+            </w:r>
+          </w:p>
+        </w:tc>
+        <w:tc>
+          <w:tcPr>
+            <w:tcW w:w="2400" w:type="dxa"/>
+          </w:tcPr>
+          <w:p>
+            <w:r>
+              <w:t xml:space="preserve">/contacts/me</w:t>
             </w:r>
           </w:p>
         </w:tc>
@@ -6120,7 +6525,91 @@
           </w:tcPr>
           <w:p>
             <w:r>
-              <w:t xml:space="preserve">Thêm sản phẩm vào giỏ</w:t>
+              <w:t xml:space="preserve">Liên hệ của tôi</w:t>
+            </w:r>
+          </w:p>
+        </w:tc>
+      </w:tr>
+      <w:tr>
+        <w:tc>
+          <w:tcPr>
+            <w:tcW w:w="2400" w:type="dxa"/>
+          </w:tcPr>
+          <w:p>
+            <w:r>
+              <w:t xml:space="preserve">GET</w:t>
+            </w:r>
+          </w:p>
+        </w:tc>
+        <w:tc>
+          <w:tcPr>
+            <w:tcW w:w="2400" w:type="dxa"/>
+          </w:tcPr>
+          <w:p>
+            <w:r>
+              <w:t xml:space="preserve">/notifications</w:t>
+            </w:r>
+          </w:p>
+        </w:tc>
+        <w:tc>
+          <w:tcPr>
+            <w:tcW w:w="2400" w:type="dxa"/>
+          </w:tcPr>
+          <w:p>
+            <w:r>
+              <w:t xml:space="preserve">User</w:t>
+            </w:r>
+          </w:p>
+        </w:tc>
+        <w:tc>
+          <w:tcPr>
+            <w:tcW w:w="2400" w:type="dxa"/>
+          </w:tcPr>
+          <w:p>
+            <w:r>
+              <w:t xml:space="preserve">Danh sách thông báo</w:t>
+            </w:r>
+          </w:p>
+        </w:tc>
+      </w:tr>
+      <w:tr>
+        <w:tc>
+          <w:tcPr>
+            <w:tcW w:w="2400" w:type="dxa"/>
+          </w:tcPr>
+          <w:p>
+            <w:r>
+              <w:t xml:space="preserve">GET</w:t>
+            </w:r>
+          </w:p>
+        </w:tc>
+        <w:tc>
+          <w:tcPr>
+            <w:tcW w:w="2400" w:type="dxa"/>
+          </w:tcPr>
+          <w:p>
+            <w:r>
+              <w:t xml:space="preserve">/notifications/stream</w:t>
+            </w:r>
+          </w:p>
+        </w:tc>
+        <w:tc>
+          <w:tcPr>
+            <w:tcW w:w="2400" w:type="dxa"/>
+          </w:tcPr>
+          <w:p>
+            <w:r>
+              <w:t xml:space="preserve">Token</w:t>
+            </w:r>
+          </w:p>
+        </w:tc>
+        <w:tc>
+          <w:tcPr>
+            <w:tcW w:w="2400" w:type="dxa"/>
+          </w:tcPr>
+          <w:p>
+            <w:r>
+              <w:t xml:space="preserve">SSE thông báo cá nhân</w:t>
             </w:r>
           </w:p>
         </w:tc>
@@ -6142,7 +6631,7 @@
           </w:tcPr>
           <w:p>
             <w:r>
-              <w:t xml:space="preserve">/cart/items/:productId</w:t>
+              <w:t xml:space="preserve">/notifications/:id/read</w:t>
             </w:r>
           </w:p>
         </w:tc>
@@ -6162,7 +6651,49 @@
           </w:tcPr>
           <w:p>
             <w:r>
-              <w:t xml:space="preserve">Cập nhật số lượng</w:t>
+              <w:t xml:space="preserve">Đánh dấu đã đọc</w:t>
+            </w:r>
+          </w:p>
+        </w:tc>
+      </w:tr>
+      <w:tr>
+        <w:tc>
+          <w:tcPr>
+            <w:tcW w:w="2400" w:type="dxa"/>
+          </w:tcPr>
+          <w:p>
+            <w:r>
+              <w:t xml:space="preserve">PATCH</w:t>
+            </w:r>
+          </w:p>
+        </w:tc>
+        <w:tc>
+          <w:tcPr>
+            <w:tcW w:w="2400" w:type="dxa"/>
+          </w:tcPr>
+          <w:p>
+            <w:r>
+              <w:t xml:space="preserve">/notifications/read-all</w:t>
+            </w:r>
+          </w:p>
+        </w:tc>
+        <w:tc>
+          <w:tcPr>
+            <w:tcW w:w="2400" w:type="dxa"/>
+          </w:tcPr>
+          <w:p>
+            <w:r>
+              <w:t xml:space="preserve">User</w:t>
+            </w:r>
+          </w:p>
+        </w:tc>
+        <w:tc>
+          <w:tcPr>
+            <w:tcW w:w="2400" w:type="dxa"/>
+          </w:tcPr>
+          <w:p>
+            <w:r>
+              <w:t xml:space="preserve">Đánh dấu tất cả</w:t>
             </w:r>
           </w:p>
         </w:tc>
@@ -6184,7 +6715,7 @@
           </w:tcPr>
           <w:p>
             <w:r>
-              <w:t xml:space="preserve">/cart/items/:productId</w:t>
+              <w:t xml:space="preserve">/notifications/:id</w:t>
             </w:r>
           </w:p>
         </w:tc>
@@ -6204,91 +6735,7 @@
           </w:tcPr>
           <w:p>
             <w:r>
-              <w:t xml:space="preserve">Xóa item</w:t>
-            </w:r>
-          </w:p>
-        </w:tc>
-      </w:tr>
-      <w:tr>
-        <w:tc>
-          <w:tcPr>
-            <w:tcW w:w="2400" w:type="dxa"/>
-          </w:tcPr>
-          <w:p>
-            <w:r>
-              <w:t xml:space="preserve">DELETE</w:t>
-            </w:r>
-          </w:p>
-        </w:tc>
-        <w:tc>
-          <w:tcPr>
-            <w:tcW w:w="2400" w:type="dxa"/>
-          </w:tcPr>
-          <w:p>
-            <w:r>
-              <w:t xml:space="preserve">/cart</w:t>
-            </w:r>
-          </w:p>
-        </w:tc>
-        <w:tc>
-          <w:tcPr>
-            <w:tcW w:w="2400" w:type="dxa"/>
-          </w:tcPr>
-          <w:p>
-            <w:r>
-              <w:t xml:space="preserve">User</w:t>
-            </w:r>
-          </w:p>
-        </w:tc>
-        <w:tc>
-          <w:tcPr>
-            <w:tcW w:w="2400" w:type="dxa"/>
-          </w:tcPr>
-          <w:p>
-            <w:r>
-              <w:t xml:space="preserve">Xóa giỏ</w:t>
-            </w:r>
-          </w:p>
-        </w:tc>
-      </w:tr>
-      <w:tr>
-        <w:tc>
-          <w:tcPr>
-            <w:tcW w:w="2400" w:type="dxa"/>
-          </w:tcPr>
-          <w:p>
-            <w:r>
-              <w:t xml:space="preserve">POST</w:t>
-            </w:r>
-          </w:p>
-        </w:tc>
-        <w:tc>
-          <w:tcPr>
-            <w:tcW w:w="2400" w:type="dxa"/>
-          </w:tcPr>
-          <w:p>
-            <w:r>
-              <w:t xml:space="preserve">/orders</w:t>
-            </w:r>
-          </w:p>
-        </w:tc>
-        <w:tc>
-          <w:tcPr>
-            <w:tcW w:w="2400" w:type="dxa"/>
-          </w:tcPr>
-          <w:p>
-            <w:r>
-              <w:t xml:space="preserve">Optional User</w:t>
-            </w:r>
-          </w:p>
-        </w:tc>
-        <w:tc>
-          <w:tcPr>
-            <w:tcW w:w="2400" w:type="dxa"/>
-          </w:tcPr>
-          <w:p>
-            <w:r>
-              <w:t xml:space="preserve">Tạo đơn hàng</w:t>
+              <w:t xml:space="preserve">Xóa thông báo</w:t>
             </w:r>
           </w:p>
         </w:tc>
@@ -6310,27 +6757,27 @@
           </w:tcPr>
           <w:p>
             <w:r>
-              <w:t xml:space="preserve">/orders/me</w:t>
-            </w:r>
-          </w:p>
-        </w:tc>
-        <w:tc>
-          <w:tcPr>
-            <w:tcW w:w="2400" w:type="dxa"/>
-          </w:tcPr>
-          <w:p>
-            <w:r>
-              <w:t xml:space="preserve">User</w:t>
-            </w:r>
-          </w:p>
-        </w:tc>
-        <w:tc>
-          <w:tcPr>
-            <w:tcW w:w="2400" w:type="dxa"/>
-          </w:tcPr>
-          <w:p>
-            <w:r>
-              <w:t xml:space="preserve">Lịch sử đơn hàng</w:t>
+              <w:t xml:space="preserve">/admin/events/stream</w:t>
+            </w:r>
+          </w:p>
+        </w:tc>
+        <w:tc>
+          <w:tcPr>
+            <w:tcW w:w="2400" w:type="dxa"/>
+          </w:tcPr>
+          <w:p>
+            <w:r>
+              <w:t xml:space="preserve">Admin token</w:t>
+            </w:r>
+          </w:p>
+        </w:tc>
+        <w:tc>
+          <w:tcPr>
+            <w:tcW w:w="2400" w:type="dxa"/>
+          </w:tcPr>
+          <w:p>
+            <w:r>
+              <w:t xml:space="preserve">SSE sự kiện admin</w:t>
             </w:r>
           </w:p>
         </w:tc>
@@ -6352,69 +6799,27 @@
           </w:tcPr>
           <w:p>
             <w:r>
-              <w:t xml:space="preserve">/orders/:orderCode</w:t>
-            </w:r>
-          </w:p>
-        </w:tc>
-        <w:tc>
-          <w:tcPr>
-            <w:tcW w:w="2400" w:type="dxa"/>
-          </w:tcPr>
-          <w:p>
-            <w:r>
-              <w:t xml:space="preserve">Optional User</w:t>
-            </w:r>
-          </w:p>
-        </w:tc>
-        <w:tc>
-          <w:tcPr>
-            <w:tcW w:w="2400" w:type="dxa"/>
-          </w:tcPr>
-          <w:p>
-            <w:r>
-              <w:t xml:space="preserve">Tra cứu đơn</w:t>
-            </w:r>
-          </w:p>
-        </w:tc>
-      </w:tr>
-      <w:tr>
-        <w:tc>
-          <w:tcPr>
-            <w:tcW w:w="2400" w:type="dxa"/>
-          </w:tcPr>
-          <w:p>
-            <w:r>
-              <w:t xml:space="preserve">POST</w:t>
-            </w:r>
-          </w:p>
-        </w:tc>
-        <w:tc>
-          <w:tcPr>
-            <w:tcW w:w="2400" w:type="dxa"/>
-          </w:tcPr>
-          <w:p>
-            <w:r>
-              <w:t xml:space="preserve">/contact</w:t>
-            </w:r>
-          </w:p>
-        </w:tc>
-        <w:tc>
-          <w:tcPr>
-            <w:tcW w:w="2400" w:type="dxa"/>
-          </w:tcPr>
-          <w:p>
-            <w:r>
-              <w:t xml:space="preserve">Optional User</w:t>
-            </w:r>
-          </w:p>
-        </w:tc>
-        <w:tc>
-          <w:tcPr>
-            <w:tcW w:w="2400" w:type="dxa"/>
-          </w:tcPr>
-          <w:p>
-            <w:r>
-              <w:t xml:space="preserve">Gửi liên hệ</w:t>
+              <w:t xml:space="preserve">/admin/summary</w:t>
+            </w:r>
+          </w:p>
+        </w:tc>
+        <w:tc>
+          <w:tcPr>
+            <w:tcW w:w="2400" w:type="dxa"/>
+          </w:tcPr>
+          <w:p>
+            <w:r>
+              <w:t xml:space="preserve">Admin</w:t>
+            </w:r>
+          </w:p>
+        </w:tc>
+        <w:tc>
+          <w:tcPr>
+            <w:tcW w:w="2400" w:type="dxa"/>
+          </w:tcPr>
+          <w:p>
+            <w:r>
+              <w:t xml:space="preserve">Dashboard</w:t>
             </w:r>
           </w:p>
         </w:tc>
@@ -6436,301 +6841,7 @@
           </w:tcPr>
           <w:p>
             <w:r>
-              <w:t xml:space="preserve">/contacts/me</w:t>
-            </w:r>
-          </w:p>
-        </w:tc>
-        <w:tc>
-          <w:tcPr>
-            <w:tcW w:w="2400" w:type="dxa"/>
-          </w:tcPr>
-          <w:p>
-            <w:r>
-              <w:t xml:space="preserve">User</w:t>
-            </w:r>
-          </w:p>
-        </w:tc>
-        <w:tc>
-          <w:tcPr>
-            <w:tcW w:w="2400" w:type="dxa"/>
-          </w:tcPr>
-          <w:p>
-            <w:r>
-              <w:t xml:space="preserve">Liên hệ của tôi</w:t>
-            </w:r>
-          </w:p>
-        </w:tc>
-      </w:tr>
-      <w:tr>
-        <w:tc>
-          <w:tcPr>
-            <w:tcW w:w="2400" w:type="dxa"/>
-          </w:tcPr>
-          <w:p>
-            <w:r>
-              <w:t xml:space="preserve">GET</w:t>
-            </w:r>
-          </w:p>
-        </w:tc>
-        <w:tc>
-          <w:tcPr>
-            <w:tcW w:w="2400" w:type="dxa"/>
-          </w:tcPr>
-          <w:p>
-            <w:r>
-              <w:t xml:space="preserve">/notifications</w:t>
-            </w:r>
-          </w:p>
-        </w:tc>
-        <w:tc>
-          <w:tcPr>
-            <w:tcW w:w="2400" w:type="dxa"/>
-          </w:tcPr>
-          <w:p>
-            <w:r>
-              <w:t xml:space="preserve">User</w:t>
-            </w:r>
-          </w:p>
-        </w:tc>
-        <w:tc>
-          <w:tcPr>
-            <w:tcW w:w="2400" w:type="dxa"/>
-          </w:tcPr>
-          <w:p>
-            <w:r>
-              <w:t xml:space="preserve">Danh sách thông báo</w:t>
-            </w:r>
-          </w:p>
-        </w:tc>
-      </w:tr>
-      <w:tr>
-        <w:tc>
-          <w:tcPr>
-            <w:tcW w:w="2400" w:type="dxa"/>
-          </w:tcPr>
-          <w:p>
-            <w:r>
-              <w:t xml:space="preserve">GET</w:t>
-            </w:r>
-          </w:p>
-        </w:tc>
-        <w:tc>
-          <w:tcPr>
-            <w:tcW w:w="2400" w:type="dxa"/>
-          </w:tcPr>
-          <w:p>
-            <w:r>
-              <w:t xml:space="preserve">/notifications/stream</w:t>
-            </w:r>
-          </w:p>
-        </w:tc>
-        <w:tc>
-          <w:tcPr>
-            <w:tcW w:w="2400" w:type="dxa"/>
-          </w:tcPr>
-          <w:p>
-            <w:r>
-              <w:t xml:space="preserve">Token</w:t>
-            </w:r>
-          </w:p>
-        </w:tc>
-        <w:tc>
-          <w:tcPr>
-            <w:tcW w:w="2400" w:type="dxa"/>
-          </w:tcPr>
-          <w:p>
-            <w:r>
-              <w:t xml:space="preserve">SSE thông báo cá nhân</w:t>
-            </w:r>
-          </w:p>
-        </w:tc>
-      </w:tr>
-      <w:tr>
-        <w:tc>
-          <w:tcPr>
-            <w:tcW w:w="2400" w:type="dxa"/>
-          </w:tcPr>
-          <w:p>
-            <w:r>
-              <w:t xml:space="preserve">PATCH</w:t>
-            </w:r>
-          </w:p>
-        </w:tc>
-        <w:tc>
-          <w:tcPr>
-            <w:tcW w:w="2400" w:type="dxa"/>
-          </w:tcPr>
-          <w:p>
-            <w:r>
-              <w:t xml:space="preserve">/notifications/:id/read</w:t>
-            </w:r>
-          </w:p>
-        </w:tc>
-        <w:tc>
-          <w:tcPr>
-            <w:tcW w:w="2400" w:type="dxa"/>
-          </w:tcPr>
-          <w:p>
-            <w:r>
-              <w:t xml:space="preserve">User</w:t>
-            </w:r>
-          </w:p>
-        </w:tc>
-        <w:tc>
-          <w:tcPr>
-            <w:tcW w:w="2400" w:type="dxa"/>
-          </w:tcPr>
-          <w:p>
-            <w:r>
-              <w:t xml:space="preserve">Đánh dấu đã đọc</w:t>
-            </w:r>
-          </w:p>
-        </w:tc>
-      </w:tr>
-      <w:tr>
-        <w:tc>
-          <w:tcPr>
-            <w:tcW w:w="2400" w:type="dxa"/>
-          </w:tcPr>
-          <w:p>
-            <w:r>
-              <w:t xml:space="preserve">PATCH</w:t>
-            </w:r>
-          </w:p>
-        </w:tc>
-        <w:tc>
-          <w:tcPr>
-            <w:tcW w:w="2400" w:type="dxa"/>
-          </w:tcPr>
-          <w:p>
-            <w:r>
-              <w:t xml:space="preserve">/notifications/read-all</w:t>
-            </w:r>
-          </w:p>
-        </w:tc>
-        <w:tc>
-          <w:tcPr>
-            <w:tcW w:w="2400" w:type="dxa"/>
-          </w:tcPr>
-          <w:p>
-            <w:r>
-              <w:t xml:space="preserve">User</w:t>
-            </w:r>
-          </w:p>
-        </w:tc>
-        <w:tc>
-          <w:tcPr>
-            <w:tcW w:w="2400" w:type="dxa"/>
-          </w:tcPr>
-          <w:p>
-            <w:r>
-              <w:t xml:space="preserve">Đánh dấu tất cả</w:t>
-            </w:r>
-          </w:p>
-        </w:tc>
-      </w:tr>
-      <w:tr>
-        <w:tc>
-          <w:tcPr>
-            <w:tcW w:w="2400" w:type="dxa"/>
-          </w:tcPr>
-          <w:p>
-            <w:r>
-              <w:t xml:space="preserve">DELETE</w:t>
-            </w:r>
-          </w:p>
-        </w:tc>
-        <w:tc>
-          <w:tcPr>
-            <w:tcW w:w="2400" w:type="dxa"/>
-          </w:tcPr>
-          <w:p>
-            <w:r>
-              <w:t xml:space="preserve">/notifications/:id</w:t>
-            </w:r>
-          </w:p>
-        </w:tc>
-        <w:tc>
-          <w:tcPr>
-            <w:tcW w:w="2400" w:type="dxa"/>
-          </w:tcPr>
-          <w:p>
-            <w:r>
-              <w:t xml:space="preserve">User</w:t>
-            </w:r>
-          </w:p>
-        </w:tc>
-        <w:tc>
-          <w:tcPr>
-            <w:tcW w:w="2400" w:type="dxa"/>
-          </w:tcPr>
-          <w:p>
-            <w:r>
-              <w:t xml:space="preserve">Xóa thông báo</w:t>
-            </w:r>
-          </w:p>
-        </w:tc>
-      </w:tr>
-      <w:tr>
-        <w:tc>
-          <w:tcPr>
-            <w:tcW w:w="2400" w:type="dxa"/>
-          </w:tcPr>
-          <w:p>
-            <w:r>
-              <w:t xml:space="preserve">GET</w:t>
-            </w:r>
-          </w:p>
-        </w:tc>
-        <w:tc>
-          <w:tcPr>
-            <w:tcW w:w="2400" w:type="dxa"/>
-          </w:tcPr>
-          <w:p>
-            <w:r>
-              <w:t xml:space="preserve">/admin/events/stream</w:t>
-            </w:r>
-          </w:p>
-        </w:tc>
-        <w:tc>
-          <w:tcPr>
-            <w:tcW w:w="2400" w:type="dxa"/>
-          </w:tcPr>
-          <w:p>
-            <w:r>
-              <w:t xml:space="preserve">Admin token</w:t>
-            </w:r>
-          </w:p>
-        </w:tc>
-        <w:tc>
-          <w:tcPr>
-            <w:tcW w:w="2400" w:type="dxa"/>
-          </w:tcPr>
-          <w:p>
-            <w:r>
-              <w:t xml:space="preserve">SSE sự kiện admin</w:t>
-            </w:r>
-          </w:p>
-        </w:tc>
-      </w:tr>
-      <w:tr>
-        <w:tc>
-          <w:tcPr>
-            <w:tcW w:w="2400" w:type="dxa"/>
-          </w:tcPr>
-          <w:p>
-            <w:r>
-              <w:t xml:space="preserve">GET</w:t>
-            </w:r>
-          </w:p>
-        </w:tc>
-        <w:tc>
-          <w:tcPr>
-            <w:tcW w:w="2400" w:type="dxa"/>
-          </w:tcPr>
-          <w:p>
-            <w:r>
-              <w:t xml:space="preserve">/admin/summary</w:t>
+              <w:t xml:space="preserve">/admin/orders?status&amp;payment&amp;customerType&amp;startDate&amp;endDate</w:t>
             </w:r>
           </w:p>
         </w:tc>
@@ -6750,49 +6861,7 @@
           </w:tcPr>
           <w:p>
             <w:r>
-              <w:t xml:space="preserve">Dashboard</w:t>
-            </w:r>
-          </w:p>
-        </w:tc>
-      </w:tr>
-      <w:tr>
-        <w:tc>
-          <w:tcPr>
-            <w:tcW w:w="2400" w:type="dxa"/>
-          </w:tcPr>
-          <w:p>
-            <w:r>
-              <w:t xml:space="preserve">GET</w:t>
-            </w:r>
-          </w:p>
-        </w:tc>
-        <w:tc>
-          <w:tcPr>
-            <w:tcW w:w="2400" w:type="dxa"/>
-          </w:tcPr>
-          <w:p>
-            <w:r>
-              <w:t xml:space="preserve">/admin/orders</w:t>
-            </w:r>
-          </w:p>
-        </w:tc>
-        <w:tc>
-          <w:tcPr>
-            <w:tcW w:w="2400" w:type="dxa"/>
-          </w:tcPr>
-          <w:p>
-            <w:r>
-              <w:t xml:space="preserve">Admin</w:t>
-            </w:r>
-          </w:p>
-        </w:tc>
-        <w:tc>
-          <w:tcPr>
-            <w:tcW w:w="2400" w:type="dxa"/>
-          </w:tcPr>
-          <w:p>
-            <w:r>
-              <w:t xml:space="preserve">Danh sách đơn</w:t>
+              <w:t xml:space="preserve">Danh sách đơn có lọc loại khách</w:t>
             </w:r>
           </w:p>
         </w:tc>
@@ -8281,7 +8350,7 @@
           </w:tcPr>
           <w:p>
             <w:r>
-              <w:t xml:space="preserve">Đơn hàng</w:t>
+              <w:t xml:space="preserve">Đơn hàng; customerType được suy ra từ user</w:t>
             </w:r>
           </w:p>
         </w:tc>
@@ -8450,6 +8519,16 @@
     <w:p>
       <w:r>
         <w:t xml:space="preserve"/>
+      </w:r>
+    </w:p>
+    <w:p>
+      <w:r>
+        <w:t xml:space="preserve"/>
+      </w:r>
+    </w:p>
+    <w:p>
+      <w:r>
+        <w:t xml:space="preserve">Ghi chú: customerType là trường API trả về khi serialize order. Hệ thống không cần lưu riêng vì có thể suy ra: có order.user là registered, không có order.user là guest.</w:t>
       </w:r>
     </w:p>
     <w:p>
@@ -12076,6 +12155,18 @@
           <w:rFonts w:ascii="Consolas" w:hAnsi="Consolas"/>
           <w:sz w:val="18"/>
         </w:rPr>
+        <w:t xml:space="preserve">    +ObjectId user</w:t>
+      </w:r>
+    </w:p>
+    <w:p>
+      <w:pPr>
+        <w:pStyle w:val="Code"/>
+      </w:pPr>
+      <w:r>
+        <w:rPr>
+          <w:rFonts w:ascii="Consolas" w:hAnsi="Consolas"/>
+          <w:sz w:val="18"/>
+        </w:rPr>
         <w:t xml:space="preserve">    +Customer customer</w:t>
       </w:r>
     </w:p>
@@ -12136,6 +12227,18 @@
           <w:rFonts w:ascii="Consolas" w:hAnsi="Consolas"/>
           <w:sz w:val="18"/>
         </w:rPr>
+        <w:t xml:space="preserve">    +getCustomerType()</w:t>
+      </w:r>
+    </w:p>
+    <w:p>
+      <w:pPr>
+        <w:pStyle w:val="Code"/>
+      </w:pPr>
+      <w:r>
+        <w:rPr>
+          <w:rFonts w:ascii="Consolas" w:hAnsi="Consolas"/>
+          <w:sz w:val="18"/>
+        </w:rPr>
         <w:t xml:space="preserve">  }</w:t>
       </w:r>
     </w:p>
@@ -12699,6 +12802,42 @@
           <w:rFonts w:ascii="Consolas" w:hAnsi="Consolas"/>
           <w:sz w:val="18"/>
         </w:rPr>
+        <w:t xml:space="preserve">  UI-&gt;&gt;API: GET /api/shop/password-public-key</w:t>
+      </w:r>
+    </w:p>
+    <w:p>
+      <w:pPr>
+        <w:pStyle w:val="Code"/>
+      </w:pPr>
+      <w:r>
+        <w:rPr>
+          <w:rFonts w:ascii="Consolas" w:hAnsi="Consolas"/>
+          <w:sz w:val="18"/>
+        </w:rPr>
+        <w:t xml:space="preserve">  API--&gt;&gt;UI: Public key RSA-OAEP</w:t>
+      </w:r>
+    </w:p>
+    <w:p>
+      <w:pPr>
+        <w:pStyle w:val="Code"/>
+      </w:pPr>
+      <w:r>
+        <w:rPr>
+          <w:rFonts w:ascii="Consolas" w:hAnsi="Consolas"/>
+          <w:sz w:val="18"/>
+        </w:rPr>
+        <w:t xml:space="preserve">  UI-&gt;&gt;UI: Mã hóa mật khẩu thành passwordEncrypted</w:t>
+      </w:r>
+    </w:p>
+    <w:p>
+      <w:pPr>
+        <w:pStyle w:val="Code"/>
+      </w:pPr>
+      <w:r>
+        <w:rPr>
+          <w:rFonts w:ascii="Consolas" w:hAnsi="Consolas"/>
+          <w:sz w:val="18"/>
+        </w:rPr>
         <w:t xml:space="preserve">  UI-&gt;&gt;API: POST /api/shop/login</w:t>
       </w:r>
     </w:p>
@@ -12711,6 +12850,18 @@
           <w:rFonts w:ascii="Consolas" w:hAnsi="Consolas"/>
           <w:sz w:val="18"/>
         </w:rPr>
+        <w:t xml:space="preserve">  API-&gt;&gt;API: Giải mã passwordEncrypted</w:t>
+      </w:r>
+    </w:p>
+    <w:p>
+      <w:pPr>
+        <w:pStyle w:val="Code"/>
+      </w:pPr>
+      <w:r>
+        <w:rPr>
+          <w:rFonts w:ascii="Consolas" w:hAnsi="Consolas"/>
+          <w:sz w:val="18"/>
+        </w:rPr>
         <w:t xml:space="preserve">  API-&gt;&gt;DB: Tìm user theo email, lấy passwordHash/Salt</w:t>
       </w:r>
     </w:p>
@@ -12950,7 +13101,7 @@
           <w:rFonts w:ascii="Consolas" w:hAnsi="Consolas"/>
           <w:sz w:val="18"/>
         </w:rPr>
-        <w:t xml:space="preserve">  API-&gt;&gt;OrderDB: Tạo Order với snapshot items</w:t>
+        <w:t xml:space="preserve">  API-&gt;&gt;OrderDB: Tạo Order với snapshot items, gắn user nếu có token</w:t>
       </w:r>
     </w:p>
     <w:p>
@@ -12974,7 +13125,7 @@
           <w:rFonts w:ascii="Consolas" w:hAnsi="Consolas"/>
           <w:sz w:val="18"/>
         </w:rPr>
-        <w:t xml:space="preserve">  API--&gt;&gt;Checkout: OrderCode và tổng tiền</w:t>
+        <w:t xml:space="preserve">  API--&gt;&gt;Checkout: OrderCode, tổng tiền và customerType</w:t>
       </w:r>
     </w:p>
     <w:p>
@@ -14468,7 +14619,7 @@
           </w:tcPr>
           <w:p>
             <w:r>
-              <w:t xml:space="preserve">Quản lý sản phẩm, danh mục, lịch sử kho</w:t>
+              <w:t xml:space="preserve">Quản lý mặt hàng kho, danh mục, lịch sử kho</w:t>
             </w:r>
           </w:p>
         </w:tc>
@@ -16234,7 +16385,7 @@
           </w:tcPr>
           <w:p>
             <w:r>
-              <w:t xml:space="preserve">Email mới, mật khẩu hợp lệ</w:t>
+              <w:t xml:space="preserve">Email mới, mật khẩu hợp lệ, passwordEncrypted</w:t>
             </w:r>
           </w:p>
         </w:tc>
@@ -16318,7 +16469,7 @@
           </w:tcPr>
           <w:p>
             <w:r>
-              <w:t xml:space="preserve">Email/password đúng</w:t>
+              <w:t xml:space="preserve">Email/password đúng, passwordEncrypted hợp lệ</w:t>
             </w:r>
           </w:p>
         </w:tc>
@@ -16360,7 +16511,7 @@
           </w:tcPr>
           <w:p>
             <w:r>
-              <w:t xml:space="preserve">Password sai</w:t>
+              <w:t xml:space="preserve">Password sai hoặc passwordEncrypted lỗi</w:t>
             </w:r>
           </w:p>
         </w:tc>
@@ -16748,7 +16899,7 @@
           </w:tcPr>
           <w:p>
             <w:r>
-              <w:t xml:space="preserve">Tạo orderCode, lưu order</w:t>
+              <w:t xml:space="preserve">Tạo orderCode, lưu order, trả customerType</w:t>
             </w:r>
           </w:p>
         </w:tc>
@@ -17341,6 +17492,48 @@
           </w:p>
         </w:tc>
       </w:tr>
+      <w:tr>
+        <w:tc>
+          <w:tcPr>
+            <w:tcW w:w="2400" w:type="dxa"/>
+          </w:tcPr>
+          <w:p>
+            <w:r>
+              <w:t xml:space="preserve">TC-28</w:t>
+            </w:r>
+          </w:p>
+        </w:tc>
+        <w:tc>
+          <w:tcPr>
+            <w:tcW w:w="2400" w:type="dxa"/>
+          </w:tcPr>
+          <w:p>
+            <w:r>
+              <w:t xml:space="preserve">Phân loại đơn hàng</w:t>
+            </w:r>
+          </w:p>
+        </w:tc>
+        <w:tc>
+          <w:tcPr>
+            <w:tcW w:w="2400" w:type="dxa"/>
+          </w:tcPr>
+          <w:p>
+            <w:r>
+              <w:t xml:space="preserve">Một đơn có user, một đơn không có user</w:t>
+            </w:r>
+          </w:p>
+        </w:tc>
+        <w:tc>
+          <w:tcPr>
+            <w:tcW w:w="2400" w:type="dxa"/>
+          </w:tcPr>
+          <w:p>
+            <w:r>
+              <w:t xml:space="preserve">Admin lọc đúng registered/guest</w:t>
+            </w:r>
+          </w:p>
+        </w:tc>
+      </w:tr>
     </w:tbl>
     <w:p>
       <w:r>
@@ -17377,7 +17570,7 @@
     </w:p>
     <w:p>
       <w:r>
-        <w:t xml:space="preserve">• Test backend services: inventoryLogService, password hash/verify, token utility.</w:t>
+        <w:t xml:space="preserve">• Test backend services: inventoryLogService, password decrypt/hash/verify, token utility.</w:t>
       </w:r>
     </w:p>
     <w:p>
@@ -17397,6 +17590,11 @@
     </w:p>
     <w:p>
       <w:r>
+        <w:t xml:space="preserve">• Test quy tắc phân loại khách: có order.user là registered, không có order.user là guest.</w:t>
+      </w:r>
+    </w:p>
+    <w:p>
+      <w:r>
         <w:t xml:space="preserve"/>
       </w:r>
     </w:p>
@@ -17430,7 +17628,7 @@
     </w:p>
     <w:p>
       <w:r>
-        <w:t xml:space="preserve">• Admin order flow: login admin -&gt; list orders -&gt; update status -&gt; notification created.</w:t>
+        <w:t xml:space="preserve">• Admin order flow: login admin -&gt; list orders/filter customerType -&gt; update status -&gt; notification created.</w:t>
       </w:r>
     </w:p>
     <w:p>

</xml_diff>

<commit_message>
feat: enhance review functionality with image uploads and admin review management
- Added support for uploading multiple review images in the client.
- Updated product page to allow users to add review images and preview them before submission.
- Enhanced admin review management to filter and display reviews with images.
- Implemented a new MCP server for handling shop data queries and health checks.
- Updated README to reflect new features and changes in the project.
</commit_message>
<xml_diff>
--- a/docs/bao-cao-phan-tich-thiet-ke-he-thong.docx
+++ b/docs/bao-cao-phan-tich-thiet-ke-he-thong.docx
@@ -374,7 +374,7 @@
     </w:p>
     <w:p>
       <w:r>
-        <w:t xml:space="preserve">• Upload file: ảnh sản phẩm và avatar người dùng.</w:t>
+        <w:t xml:space="preserve">• Upload file: ảnh sản phẩm, ảnh mô tả sản phẩm, ảnh review và avatar người dùng.</w:t>
       </w:r>
     </w:p>
     <w:p>
@@ -577,7 +577,7 @@
           </w:tcPr>
           <w:p>
             <w:r>
-              <w:t xml:space="preserve">Thư mục uploads trên server dùng cho ảnh sản phẩm/avatar</w:t>
+              <w:t xml:space="preserve">Thư mục uploads trên server dùng cho ảnh sản phẩm/review/avatar</w:t>
             </w:r>
           </w:p>
         </w:tc>
@@ -927,7 +927,7 @@
           </w:tcPr>
           <w:p>
             <w:r>
-              <w:t xml:space="preserve">Xem chi tiết sản phẩm bằng slug có phân biệt sản phẩm trùng tên</w:t>
+              <w:t xml:space="preserve">Xem chi tiết sản phẩm bằng slug có phân biệt sản phẩm trùng tên, hỗ trợ gallery ảnh mô tả</w:t>
             </w:r>
           </w:p>
         </w:tc>
@@ -959,7 +959,7 @@
           </w:tcPr>
           <w:p>
             <w:r>
-              <w:t xml:space="preserve">Người dùng đăng nhập mới được gửi đánh giá sản phẩm</w:t>
+              <w:t xml:space="preserve">Người dùng đăng nhập mới được gửi đánh giá sản phẩm, có thể đính kèm nhiều ảnh review</w:t>
             </w:r>
           </w:p>
         </w:tc>
@@ -1311,7 +1311,7 @@
           </w:tcPr>
           <w:p>
             <w:r>
-              <w:t xml:space="preserve">Quản lý kho hàng: sản phẩm, tồn kho, ảnh, danh mục</w:t>
+              <w:t xml:space="preserve">Quản lý kho hàng: sản phẩm, tồn kho, ảnh chính, ảnh mô tả, danh mục</w:t>
             </w:r>
           </w:p>
         </w:tc>
@@ -1471,7 +1471,7 @@
           </w:tcPr>
           <w:p>
             <w:r>
-              <w:t xml:space="preserve">Quản lý đánh giá sản phẩm</w:t>
+              <w:t xml:space="preserve">Quản lý đánh giá sản phẩm, lọc review có ảnh và xem dialog chi tiết</w:t>
             </w:r>
           </w:p>
         </w:tc>
@@ -2057,6 +2057,11 @@
     </w:p>
     <w:p>
       <w:r>
+        <w:t xml:space="preserve">• Review cho phép tối đa 4 ảnh, mỗi ảnh nhỏ hơn 2MB; ảnh sản phẩm và ảnh mô tả sản phẩm dùng giới hạn upload ảnh sản phẩm.</w:t>
+      </w:r>
+    </w:p>
+    <w:p>
+      <w:r>
         <w:t xml:space="preserve"/>
       </w:r>
     </w:p>
@@ -3453,7 +3458,7 @@
           </w:tcPr>
           <w:p>
             <w:r>
-              <w:t xml:space="preserve">Mở URL slug; giải mã id; tải sản phẩm/review; hiển thị ảnh, giá, tồn kho</w:t>
+              <w:t xml:space="preserve">Mở URL slug; giải mã id; tải sản phẩm/review; hiển thị ảnh chính, gallery ảnh mô tả, giá, tồn kho</w:t>
             </w:r>
           </w:p>
         </w:tc>
@@ -3505,17 +3510,17 @@
           </w:tcPr>
           <w:p>
             <w:r>
-              <w:t xml:space="preserve">Chọn sao, nhập bình luận; gửi review; server lưu và cập nhật rating</w:t>
-            </w:r>
-          </w:p>
-        </w:tc>
-        <w:tc>
-          <w:tcPr>
-            <w:tcW w:w="2400" w:type="dxa"/>
-          </w:tcPr>
-          <w:p>
-            <w:r>
-              <w:t xml:space="preserve">Chưa đăng nhập thì hiện popup login; rating ngoài 1-5</w:t>
+              <w:t xml:space="preserve">Chọn sao, nhập bình luận, chọn ảnh nếu có; gửi review; server lưu ảnh review và cập nhật rating</w:t>
+            </w:r>
+          </w:p>
+        </w:tc>
+        <w:tc>
+          <w:tcPr>
+            <w:tcW w:w="2400" w:type="dxa"/>
+          </w:tcPr>
+          <w:p>
+            <w:r>
+              <w:t xml:space="preserve">Chưa đăng nhập thì hiện popup login; rating ngoài 1-5; ảnh quá giới hạn</w:t>
             </w:r>
           </w:p>
         </w:tc>
@@ -3921,7 +3926,7 @@
           </w:tcPr>
           <w:p>
             <w:r>
-              <w:t xml:space="preserve">Thêm/sửa/xóa sản phẩm; upload ảnh; quản lý category; xem lịch sử kho</w:t>
+              <w:t xml:space="preserve">Thêm/sửa/xóa sản phẩm; upload ảnh chính/ảnh mô tả; quản lý category; xem lịch sử kho</w:t>
             </w:r>
           </w:p>
         </w:tc>
@@ -4077,7 +4082,7 @@
           </w:tcPr>
           <w:p>
             <w:r>
-              <w:t xml:space="preserve">Lọc liên hệ/review; cập nhật trạng thái liên hệ; xóa review vi phạm</w:t>
+              <w:t xml:space="preserve">Lọc liên hệ/review; lọc review có ảnh; mở dialog chi tiết review; cập nhật trạng thái liên hệ; xóa review vi phạm</w:t>
             </w:r>
           </w:p>
         </w:tc>
@@ -5258,7 +5263,7 @@
           </w:tcPr>
           <w:p>
             <w:r>
-              <w:t xml:space="preserve">Xem và tạo đánh giá</w:t>
+              <w:t xml:space="preserve">Xem và tạo đánh giá, lưu ảnh review</w:t>
             </w:r>
           </w:p>
         </w:tc>
@@ -5386,7 +5391,7 @@
           </w:tcPr>
           <w:p>
             <w:r>
-              <w:t xml:space="preserve">Quản lý kho, category, upload ảnh, lịch sử kho</w:t>
+              <w:t xml:space="preserve">Quản lý kho, category, upload ảnh chính/ảnh mô tả, lịch sử kho</w:t>
             </w:r>
           </w:p>
         </w:tc>
@@ -6105,7 +6110,7 @@
           </w:tcPr>
           <w:p>
             <w:r>
-              <w:t xml:space="preserve">Tạo review</w:t>
+              <w:t xml:space="preserve">Tạo review, tùy chọn mảng ảnh review</w:t>
             </w:r>
           </w:p>
         </w:tc>
@@ -7155,7 +7160,7 @@
           </w:tcPr>
           <w:p>
             <w:r>
-              <w:t xml:space="preserve">Danh sách review</w:t>
+              <w:t xml:space="preserve">Danh sách review, hỗ trợ lọc số sao và có/không có ảnh</w:t>
             </w:r>
           </w:p>
         </w:tc>
@@ -8212,7 +8217,7 @@
           </w:tcPr>
           <w:p>
             <w:r>
-              <w:t xml:space="preserve">legacyId, name, category, price, rating, stock, image, description</w:t>
+              <w:t xml:space="preserve">legacyId, name, category, price, rating, stock, image, images, description</w:t>
             </w:r>
           </w:p>
         </w:tc>
@@ -8404,7 +8409,7 @@
           </w:tcPr>
           <w:p>
             <w:r>
-              <w:t xml:space="preserve">productId, user, name, rating, comment</w:t>
+              <w:t xml:space="preserve">productId, user, name, rating, comment, images</w:t>
             </w:r>
           </w:p>
         </w:tc>
@@ -10163,6 +10168,18 @@
           <w:rFonts w:ascii="Consolas" w:hAnsi="Consolas"/>
           <w:sz w:val="18"/>
         </w:rPr>
+        <w:t xml:space="preserve">  images_json TEXT,</w:t>
+      </w:r>
+    </w:p>
+    <w:p>
+      <w:pPr>
+        <w:pStyle w:val="Code"/>
+      </w:pPr>
+      <w:r>
+        <w:rPr>
+          <w:rFonts w:ascii="Consolas" w:hAnsi="Consolas"/>
+          <w:sz w:val="18"/>
+        </w:rPr>
         <w:t xml:space="preserve">  description TEXT NOT NULL,</w:t>
       </w:r>
     </w:p>
@@ -10919,6 +10936,18 @@
           <w:rFonts w:ascii="Consolas" w:hAnsi="Consolas"/>
           <w:sz w:val="18"/>
         </w:rPr>
+        <w:t xml:space="preserve">  images_json TEXT,</w:t>
+      </w:r>
+    </w:p>
+    <w:p>
+      <w:pPr>
+        <w:pStyle w:val="Code"/>
+      </w:pPr>
+      <w:r>
+        <w:rPr>
+          <w:rFonts w:ascii="Consolas" w:hAnsi="Consolas"/>
+          <w:sz w:val="18"/>
+        </w:rPr>
         <w:t xml:space="preserve">  created_at TIMESTAMP NOT NULL,</w:t>
       </w:r>
     </w:p>
@@ -12011,6 +12040,18 @@
           <w:rFonts w:ascii="Consolas" w:hAnsi="Consolas"/>
           <w:sz w:val="18"/>
         </w:rPr>
+        <w:t xml:space="preserve">    +String[] images</w:t>
+      </w:r>
+    </w:p>
+    <w:p>
+      <w:pPr>
+        <w:pStyle w:val="Code"/>
+      </w:pPr>
+      <w:r>
+        <w:rPr>
+          <w:rFonts w:ascii="Consolas" w:hAnsi="Consolas"/>
+          <w:sz w:val="18"/>
+        </w:rPr>
         <w:t xml:space="preserve">    +String description</w:t>
       </w:r>
     </w:p>
@@ -12300,6 +12341,18 @@
           <w:sz w:val="18"/>
         </w:rPr>
         <w:t xml:space="preserve">    +String comment</w:t>
+      </w:r>
+    </w:p>
+    <w:p>
+      <w:pPr>
+        <w:pStyle w:val="Code"/>
+      </w:pPr>
+      <w:r>
+        <w:rPr>
+          <w:rFonts w:ascii="Consolas" w:hAnsi="Consolas"/>
+          <w:sz w:val="18"/>
+        </w:rPr>
+        <w:t xml:space="preserve">    +String[] images</w:t>
       </w:r>
     </w:p>
     <w:p>
@@ -14331,7 +14384,7 @@
           </w:tcPr>
           <w:p>
             <w:r>
-              <w:t xml:space="preserve">Xem ảnh, giá, mô tả, tồn kho, review, thêm giỏ</w:t>
+              <w:t xml:space="preserve">Xem ảnh chính, gallery ảnh mô tả, giá, mô tả, tồn kho, review, thêm giỏ</w:t>
             </w:r>
           </w:p>
         </w:tc>
@@ -14747,7 +14800,7 @@
           </w:tcPr>
           <w:p>
             <w:r>
-              <w:t xml:space="preserve">Lọc và xóa đánh giá</w:t>
+              <w:t xml:space="preserve">Lọc đánh giá, lọc review có ảnh, mở dialog chi tiết, xóa đánh giá</w:t>
             </w:r>
           </w:p>
         </w:tc>
@@ -15054,7 +15107,7 @@
           <w:rFonts w:ascii="Consolas" w:hAnsi="Consolas"/>
           <w:sz w:val="18"/>
         </w:rPr>
-        <w:t xml:space="preserve">| Product Image           | Name, Rating, Price              |</w:t>
+        <w:t xml:space="preserve">| Product Image/Gallery   | Name, Rating, Price              |</w:t>
       </w:r>
     </w:p>
     <w:p>
@@ -15126,7 +15179,7 @@
           <w:rFonts w:ascii="Consolas" w:hAnsi="Consolas"/>
           <w:sz w:val="18"/>
         </w:rPr>
-        <w:t xml:space="preserve">| Reviews: star input, comment list                          |</w:t>
+        <w:t xml:space="preserve">| Reviews: star input, ảnh review, comment list              |</w:t>
       </w:r>
     </w:p>
     <w:p>
@@ -16763,17 +16816,17 @@
           </w:tcPr>
           <w:p>
             <w:r>
-              <w:t xml:space="preserve">Rating 1-5, comment hợp lệ</w:t>
-            </w:r>
-          </w:p>
-        </w:tc>
-        <w:tc>
-          <w:tcPr>
-            <w:tcW w:w="2400" w:type="dxa"/>
-          </w:tcPr>
-          <w:p>
-            <w:r>
-              <w:t xml:space="preserve">Review được lưu</w:t>
+              <w:t xml:space="preserve">Rating 1-5, comment hợp lệ, tùy chọn ảnh review</w:t>
+            </w:r>
+          </w:p>
+        </w:tc>
+        <w:tc>
+          <w:tcPr>
+            <w:tcW w:w="2400" w:type="dxa"/>
+          </w:tcPr>
+          <w:p>
+            <w:r>
+              <w:t xml:space="preserve">Review và ảnh được lưu</w:t>
             </w:r>
           </w:p>
         </w:tc>
@@ -17235,7 +17288,7 @@
           </w:tcPr>
           <w:p>
             <w:r>
-              <w:t xml:space="preserve">Server trả URL uploads</w:t>
+              <w:t xml:space="preserve">Server trả URL uploads, dùng được cho ảnh chính và ảnh mô tả</w:t>
             </w:r>
           </w:p>
         </w:tc>
@@ -17393,17 +17446,17 @@
           </w:tcPr>
           <w:p>
             <w:r>
-              <w:t xml:space="preserve">Admin xóa review</w:t>
-            </w:r>
-          </w:p>
-        </w:tc>
-        <w:tc>
-          <w:tcPr>
-            <w:tcW w:w="2400" w:type="dxa"/>
-          </w:tcPr>
-          <w:p>
-            <w:r>
-              <w:t xml:space="preserve">Review biến mất khỏi danh sách</w:t>
+              <w:t xml:space="preserve">Admin xóa review từ bảng/dialog chi tiết</w:t>
+            </w:r>
+          </w:p>
+        </w:tc>
+        <w:tc>
+          <w:tcPr>
+            <w:tcW w:w="2400" w:type="dxa"/>
+          </w:tcPr>
+          <w:p>
+            <w:r>
+              <w:t xml:space="preserve">Review biến mất khỏi danh sách và rating được tính lại</w:t>
             </w:r>
           </w:p>
         </w:tc>
@@ -17731,7 +17784,7 @@
     </w:p>
     <w:p>
       <w:r>
-        <w:t xml:space="preserve">3. Thêm sản phẩm và upload ảnh.</w:t>
+        <w:t xml:space="preserve">3. Thêm sản phẩm và upload ảnh chính/ảnh mô tả.</w:t>
       </w:r>
     </w:p>
     <w:p>
@@ -17756,7 +17809,7 @@
     </w:p>
     <w:p>
       <w:r>
-        <w:t xml:space="preserve">8. Lọc khách hàng, người dùng, liên hệ, đánh giá.</w:t>
+        <w:t xml:space="preserve">8. Lọc khách hàng, người dùng, liên hệ, đánh giá; mở dialog chi tiết review có ảnh.</w:t>
       </w:r>
     </w:p>
     <w:p>

</xml_diff>